<commit_message>
update operations and settings
</commit_message>
<xml_diff>
--- a/GENERATED_FILES/TP.1 DETO_BMR.docx
+++ b/GENERATED_FILES/TP.1 DETO_BMR.docx
@@ -1163,7 +1163,7 @@
                 <w:b/>
                 <w:bCs/>
               </w:rPr>
-              <w:t xml:space="preserve">+20… +30oC [WARNING, PARAMETER IS PC]</w:t>
+              <w:t xml:space="preserve">+20… +30oC</w:t>
             </w:r>
             <w:r>
               <w:rPr>
@@ -2662,7 +2662,7 @@
                 <w:b/>
                 <w:bCs/>
               </w:rPr>
-              <w:t xml:space="preserve">20-35oC</w:t>
+              <w:t xml:space="preserve">20-30oC</w:t>
             </w:r>
             <w:r>
               <w:rPr>
@@ -3781,7 +3781,7 @@
                 <w:b w:val="false"/>
                 <w:bCs w:val="false"/>
               </w:rPr>
-              <w:t xml:space="preserve">COMMENT INFO: in pre-val check ipc more often (like every 6h take a sample)
+              <w:t xml:space="preserve">COMMENT INFO: in pre-val check IPC showed: 17h - 10% / 86%; 21h - 8.8% / 91%; 41h - 6% / 93%;
 </w:t>
             </w:r>
           </w:p>
@@ -9199,7 +9199,7 @@
                 <w:b w:val="false"/>
                 <w:bCs w:val="false"/>
               </w:rPr>
-              <w:t xml:space="preserve">.</w:t>
+              <w:t xml:space="preserve">. In 2-3h weight loss should be less than 2-3%.</w:t>
             </w:r>
           </w:p>
           <w:p>
@@ -9407,187 +9407,53 @@
                 <w:b/>
                 <w:bCs/>
               </w:rPr>
-              <w:t xml:space="preserve">Dry</w:t>
-            </w:r>
-            <w:r>
-              <w:rPr>
-                <w:b w:val="false"/>
-                <w:bCs w:val="false"/>
-              </w:rPr>
-              <w:t xml:space="preserve"> the product in vacuum oven 012-XX:</w:t>
-            </w:r>
-          </w:p>
-          <w:p>
-            <w:r>
-              <w:rPr>
-                <w:b w:val="false"/>
-                <w:bCs w:val="false"/>
-              </w:rPr>
-              <w:t xml:space="preserve">1. Check and record the tare mass of each tray into table XX.1. </w:t>
-            </w:r>
-          </w:p>
-          <w:p>
-            <w:r>
-              <w:rPr>
-                <w:b w:val="false"/>
-                <w:bCs w:val="false"/>
-              </w:rPr>
-              <w:t xml:space="preserve">2. Transfer the product (filter cake) onto trays with a layer thickness of </w:t>
-            </w:r>
-            <w:r>
-              <w:rPr>
-                <w:b/>
-                <w:bCs/>
-              </w:rPr>
-              <w:t xml:space="preserve">NMT 4cm</w:t>
-            </w:r>
-            <w:r>
-              <w:rPr>
-                <w:b w:val="false"/>
-                <w:bCs w:val="false"/>
-              </w:rPr>
-              <w:t xml:space="preserve">. Divide all wet product approximately evenly between all trays. Crush big lumps with shovel.</w:t>
-            </w:r>
-          </w:p>
-          <w:p>
-            <w:r>
-              <w:rPr>
-                <w:b w:val="false"/>
-                <w:bCs w:val="false"/>
-              </w:rPr>
-              <w:t xml:space="preserve">3. Place the trays in the vacuum oven.</w:t>
-            </w:r>
-          </w:p>
-          <w:p>
-            <w:r>
-              <w:rPr>
-                <w:b w:val="false"/>
-                <w:bCs w:val="false"/>
-              </w:rPr>
-              <w:t xml:space="preserve">4. Connect vacuum pump to the oven via cold trap with dry ice.</w:t>
-            </w:r>
-          </w:p>
-          <w:p>
-            <w:r>
-              <w:rPr>
-                <w:b w:val="false"/>
-                <w:bCs w:val="false"/>
-              </w:rPr>
-              <w:t xml:space="preserve">5. Set overheating protection of the oven to: </w:t>
-            </w:r>
-            <w:r>
-              <w:rPr>
-                <w:b/>
-                <w:bCs/>
-              </w:rPr>
-              <w:t xml:space="preserve">60oC</w:t>
-            </w:r>
-            <w:r>
-              <w:rPr>
-                <w:b w:val="false"/>
-                <w:bCs w:val="false"/>
-              </w:rPr>
-              <w:t xml:space="preserve">.</w:t>
-            </w:r>
-          </w:p>
-          <w:p>
-            <w:r>
-              <w:rPr>
-                <w:b w:val="false"/>
-                <w:bCs w:val="false"/>
-              </w:rPr>
-              <w:t xml:space="preserve">6. Dry the product, checking the weight periodically (NLT 12h after start of drying) to determine dryness </w:t>
-            </w:r>
-            <w:r>
-              <w:rPr>
-                <w:b/>
-                <w:bCs/>
-              </w:rPr>
-              <w:t xml:space="preserve">24-36h</w:t>
-            </w:r>
-            <w:r>
-              <w:rPr>
-                <w:b w:val="false"/>
-                <w:bCs w:val="false"/>
-              </w:rPr>
-              <w:t xml:space="preserve">.</w:t>
-            </w:r>
-          </w:p>
-          <w:p>
-            <w:r>
-              <w:rPr>
-                <w:b w:val="false"/>
-                <w:bCs w:val="false"/>
-              </w:rPr>
-              <w:t xml:space="preserve">7. Perform Mix/delump: </w:t>
-            </w:r>
-            <w:r>
-              <w:rPr>
-                <w:b/>
-                <w:bCs/>
-              </w:rPr>
-              <w:t xml:space="preserve">after 12-18h.</w:t>
-            </w:r>
-            <w:r>
-              <w:rPr>
-                <w:b w:val="false"/>
-                <w:bCs w:val="false"/>
-              </w:rPr>
-              <w:t xml:space="preserve">.</w:t>
+              <w:t xml:space="preserve">Finish</w:t>
+            </w:r>
+            <w:r>
+              <w:rPr>
+                <w:b w:val="false"/>
+                <w:bCs w:val="false"/>
+              </w:rPr>
+              <w:t xml:space="preserve"> drying:</w:t>
+            </w:r>
+          </w:p>
+          <w:p>
+            <w:r>
+              <w:rPr>
+                <w:b w:val="false"/>
+                <w:bCs w:val="false"/>
+              </w:rPr>
+              <w:t xml:space="preserve">  1. Save heating/cooling circulator 011-XX temperature logs on the USB stick that is inside the control panel or in the USB ports.</w:t>
+            </w:r>
+          </w:p>
+          <w:p>
+            <w:r>
+              <w:rPr>
+                <w:b w:val="false"/>
+                <w:bCs w:val="false"/>
+              </w:rPr>
+              <w:t xml:space="preserve">  2. Turn off membrane pump and repressurize the oven. Turn off the oven.</w:t>
+            </w:r>
+          </w:p>
+          <w:p>
+            <w:r>
+              <w:rPr>
+                <w:b w:val="false"/>
+                <w:bCs w:val="false"/>
+              </w:rPr>
+              <w:t xml:space="preserve">  3. Remove the trays from the oven and weigh them. Calculate loss on drying and fill Table X.</w:t>
+            </w:r>
+          </w:p>
+          <w:p>
+            <w:r>
+              <w:rPr>
+                <w:b w:val="false"/>
+                <w:bCs w:val="false"/>
+              </w:rPr>
+              <w:t xml:space="preserve">  4. Calculate process yield:</w:t>
             </w:r>
           </w:p>
           <w:p/>
-          <w:p>
-            <w:r>
-              <w:rPr>
-                <w:b w:val="false"/>
-                <w:bCs w:val="false"/>
-              </w:rPr>
-              <w:t xml:space="preserve">Record weights in Table X.</w:t>
-            </w:r>
-          </w:p>
-          <w:p/>
-          <w:p>
-            <w:r>
-              <w:rPr>
-                <w:b w:val="false"/>
-                <w:bCs w:val="false"/>
-              </w:rPr>
-              <w:t xml:space="preserve">Table X filled: </w:t>
-            </w:r>
-          </w:p>
-          <w:p/>
-          <w:p>
-            <w:r>
-              <w:rPr>
-                <w:b w:val="false"/>
-                <w:bCs w:val="false"/>
-              </w:rPr>
-              <w:t xml:space="preserve">Overheating set: .......°C</w:t>
-            </w:r>
-          </w:p>
-          <w:p/>
-          <w:p>
-            <w:r>
-              <w:rPr>
-                <w:b w:val="false"/>
-                <w:bCs w:val="false"/>
-              </w:rPr>
-              <w:t xml:space="preserve">Actual pressure after at least 1h from the start: ...... Torr</w:t>
-            </w:r>
-          </w:p>
-          <w:p/>
-          <w:p>
-            <w:r>
-              <w:rPr>
-                <w:b w:val="false"/>
-                <w:bCs w:val="false"/>
-              </w:rPr>
-              <w:t xml:space="preserve">Temperature after at least 1h from the start: .......°C</w:t>
-            </w:r>
-          </w:p>
-          <w:p/>
-          <w:p/>
         </w:tc>
         <w:tc>
           <w:p>
@@ -9612,11 +9478,6 @@
           </w:p>
         </w:tc>
         <w:tc>
-          <w:p>
-            <w:r>
-              <w:t xml:space="preserve">Actual temperature set : ........ oC;</w:t>
-            </w:r>
-          </w:p>
           <w:p>
             <w:r>
               <w:t xml:space="preserve"/>
@@ -9639,53 +9500,108 @@
                 <w:b/>
                 <w:bCs/>
               </w:rPr>
-              <w:t xml:space="preserve">Finish</w:t>
-            </w:r>
-            <w:r>
-              <w:rPr>
-                <w:b w:val="false"/>
-                <w:bCs w:val="false"/>
-              </w:rPr>
-              <w:t xml:space="preserve"> drying:</w:t>
-            </w:r>
-          </w:p>
-          <w:p>
-            <w:r>
-              <w:rPr>
-                <w:b w:val="false"/>
-                <w:bCs w:val="false"/>
-              </w:rPr>
-              <w:t xml:space="preserve">  1. Save heating/cooling circulator 011-XX temperature logs on the USB stick that is inside the control panel or in the USB ports.</w:t>
-            </w:r>
-          </w:p>
-          <w:p>
-            <w:r>
-              <w:rPr>
-                <w:b w:val="false"/>
-                <w:bCs w:val="false"/>
-              </w:rPr>
-              <w:t xml:space="preserve">  2. Turn off membrane pump and repressurize the oven. Turn off the oven.</w:t>
-            </w:r>
-          </w:p>
-          <w:p>
-            <w:r>
-              <w:rPr>
-                <w:b w:val="false"/>
-                <w:bCs w:val="false"/>
-              </w:rPr>
-              <w:t xml:space="preserve">  3. Remove the trays from the oven and weigh them. Calculate loss on drying and fill Table X.</w:t>
-            </w:r>
-          </w:p>
-          <w:p>
-            <w:r>
-              <w:rPr>
-                <w:b w:val="false"/>
-                <w:bCs w:val="false"/>
-              </w:rPr>
-              <w:t xml:space="preserve">  4. Calculate process yield:</w:t>
-            </w:r>
-          </w:p>
-          <w:p/>
+              <w:t xml:space="preserve">Pack</w:t>
+            </w:r>
+            <w:r>
+              <w:rPr>
+                <w:b w:val="false"/>
+                <w:bCs w:val="false"/>
+              </w:rPr>
+              <w:t xml:space="preserve"> the product:</w:t>
+            </w:r>
+          </w:p>
+          <w:p>
+            <w:r>
+              <w:rPr>
+                <w:b w:val="false"/>
+                <w:bCs w:val="false"/>
+              </w:rPr>
+              <w:t xml:space="preserve">1. Use analytical sample amount: </w:t>
+            </w:r>
+            <w:r>
+              <w:rPr>
+                <w:b/>
+                <w:bCs/>
+              </w:rPr>
+              <w:t xml:space="preserve">2g</w:t>
+            </w:r>
+            <w:r>
+              <w:rPr>
+                <w:b w:val="false"/>
+                <w:bCs w:val="false"/>
+              </w:rPr>
+              <w:t xml:space="preserve">.</w:t>
+            </w:r>
+          </w:p>
+          <w:p>
+            <w:r>
+              <w:rPr>
+                <w:b w:val="false"/>
+                <w:bCs w:val="false"/>
+              </w:rPr>
+              <w:t xml:space="preserve">2. Retain sample amount: </w:t>
+            </w:r>
+            <w:r>
+              <w:rPr>
+                <w:b/>
+                <w:bCs/>
+              </w:rPr>
+              <w:t xml:space="preserve">4g</w:t>
+            </w:r>
+            <w:r>
+              <w:rPr>
+                <w:b w:val="false"/>
+                <w:bCs w:val="false"/>
+              </w:rPr>
+              <w:t xml:space="preserve">.</w:t>
+            </w:r>
+          </w:p>
+          <w:p>
+            <w:r>
+              <w:rPr>
+                <w:b w:val="false"/>
+                <w:bCs w:val="false"/>
+              </w:rPr>
+              <w:t xml:space="preserve">3. Pack using: </w:t>
+            </w:r>
+            <w:r>
+              <w:rPr>
+                <w:b/>
+                <w:bCs/>
+              </w:rPr>
+              <w:t xml:space="preserve">double PE bag.</w:t>
+            </w:r>
+            <w:r>
+              <w:rPr>
+                <w:b w:val="false"/>
+                <w:bCs w:val="false"/>
+              </w:rPr>
+              <w:t xml:space="preserve">.</w:t>
+            </w:r>
+          </w:p>
+          <w:p>
+            <w:r>
+              <w:rPr>
+                <w:b w:val="false"/>
+                <w:bCs w:val="false"/>
+              </w:rPr>
+              <w:t xml:space="preserve">4. Consider air, moisture, and light sensitivity of the material: </w:t>
+            </w:r>
+            <w:r>
+              <w:rPr>
+                <w:b/>
+                <w:bCs/>
+              </w:rPr>
+              <w:t xml:space="preserve">NO</w:t>
+            </w:r>
+            <w:r>
+              <w:rPr>
+                <w:b w:val="false"/>
+                <w:bCs w:val="false"/>
+              </w:rPr>
+              <w:t xml:space="preserve">.</w:t>
+            </w:r>
+          </w:p>
         </w:tc>
         <w:tc>
           <w:p>
@@ -9732,106 +9648,51 @@
                 <w:b/>
                 <w:bCs/>
               </w:rPr>
-              <w:t xml:space="preserve">Pack</w:t>
-            </w:r>
-            <w:r>
-              <w:rPr>
-                <w:b w:val="false"/>
-                <w:bCs w:val="false"/>
-              </w:rPr>
-              <w:t xml:space="preserve"> the product:</w:t>
-            </w:r>
-          </w:p>
-          <w:p>
-            <w:r>
-              <w:rPr>
-                <w:b w:val="false"/>
-                <w:bCs w:val="false"/>
-              </w:rPr>
-              <w:t xml:space="preserve">1. Use analytical sample amount: </w:t>
-            </w:r>
-            <w:r>
-              <w:rPr>
-                <w:b/>
-                <w:bCs/>
-              </w:rPr>
-              <w:t xml:space="preserve">2g</w:t>
-            </w:r>
-            <w:r>
-              <w:rPr>
-                <w:b w:val="false"/>
-                <w:bCs w:val="false"/>
-              </w:rPr>
-              <w:t xml:space="preserve">.</w:t>
-            </w:r>
-          </w:p>
-          <w:p>
-            <w:r>
-              <w:rPr>
-                <w:b w:val="false"/>
-                <w:bCs w:val="false"/>
-              </w:rPr>
-              <w:t xml:space="preserve">2. Retain sample amount: </w:t>
-            </w:r>
-            <w:r>
-              <w:rPr>
-                <w:b/>
-                <w:bCs/>
-              </w:rPr>
-              <w:t xml:space="preserve">4g</w:t>
-            </w:r>
-            <w:r>
-              <w:rPr>
-                <w:b w:val="false"/>
-                <w:bCs w:val="false"/>
-              </w:rPr>
-              <w:t xml:space="preserve">.</w:t>
-            </w:r>
-          </w:p>
-          <w:p>
-            <w:r>
-              <w:rPr>
-                <w:b w:val="false"/>
-                <w:bCs w:val="false"/>
-              </w:rPr>
-              <w:t xml:space="preserve">3. Pack using: </w:t>
-            </w:r>
-            <w:r>
-              <w:rPr>
-                <w:b/>
-                <w:bCs/>
-              </w:rPr>
-              <w:t xml:space="preserve">double PE bag.</w:t>
-            </w:r>
-            <w:r>
-              <w:rPr>
-                <w:b w:val="false"/>
-                <w:bCs w:val="false"/>
-              </w:rPr>
-              <w:t xml:space="preserve">.</w:t>
-            </w:r>
-          </w:p>
-          <w:p>
-            <w:r>
-              <w:rPr>
-                <w:b w:val="false"/>
-                <w:bCs w:val="false"/>
-              </w:rPr>
-              <w:t xml:space="preserve">4. Consider air, moisture, and light sensitivity of the material: </w:t>
-            </w:r>
-            <w:r>
-              <w:rPr>
-                <w:b/>
-                <w:bCs/>
-              </w:rPr>
-              <w:t xml:space="preserve">NO</w:t>
-            </w:r>
-            <w:r>
-              <w:rPr>
-                <w:b w:val="false"/>
-                <w:bCs w:val="false"/>
-              </w:rPr>
-              <w:t xml:space="preserve">.</w:t>
+              <w:t xml:space="preserve">Perform</w:t>
+            </w:r>
+            <w:r>
+              <w:rPr>
+                <w:b w:val="false"/>
+                <w:bCs w:val="false"/>
+              </w:rPr>
+              <w:t xml:space="preserve"> the analysis according to QDQS:</w:t>
+            </w:r>
+          </w:p>
+          <w:p>
+            <w:r>
+              <w:rPr>
+                <w:b w:val="false"/>
+                <w:bCs w:val="false"/>
+              </w:rPr>
+              <w:t xml:space="preserve">1. If analysis result is YES, proceed accordingly.</w:t>
+            </w:r>
+          </w:p>
+          <w:p>
+            <w:r>
+              <w:rPr>
+                <w:b w:val="false"/>
+                <w:bCs w:val="false"/>
+              </w:rPr>
+              <w:t xml:space="preserve">2. If analysis result is NO, repeat necessary steps.</w:t>
+            </w:r>
+          </w:p>
+          <w:p>
+            <w:r>
+              <w:rPr>
+                <w:b w:val="false"/>
+                <w:bCs w:val="false"/>
+              </w:rPr>
+              <w:t xml:space="preserve">COMMENT INFO: continue
+</w:t>
+            </w:r>
+          </w:p>
+          <w:p>
+            <w:r>
+              <w:rPr>
+                <w:b w:val="false"/>
+                <w:bCs w:val="false"/>
+              </w:rPr>
+              <w:t xml:space="preserve">rnd will check. We need re-crystallization?</w:t>
             </w:r>
           </w:p>
         </w:tc>
@@ -9880,51 +9741,60 @@
                 <w:b/>
                 <w:bCs/>
               </w:rPr>
-              <w:t xml:space="preserve">Perform</w:t>
-            </w:r>
-            <w:r>
-              <w:rPr>
-                <w:b w:val="false"/>
-                <w:bCs w:val="false"/>
-              </w:rPr>
-              <w:t xml:space="preserve"> the analysis according to QDQS:</w:t>
-            </w:r>
-          </w:p>
-          <w:p>
-            <w:r>
-              <w:rPr>
-                <w:b w:val="false"/>
-                <w:bCs w:val="false"/>
-              </w:rPr>
-              <w:t xml:space="preserve">1. If analysis result is YES, proceed accordingly.</w:t>
-            </w:r>
-          </w:p>
-          <w:p>
-            <w:r>
-              <w:rPr>
-                <w:b w:val="false"/>
-                <w:bCs w:val="false"/>
-              </w:rPr>
-              <w:t xml:space="preserve">2. If analysis result is NO, repeat necessary steps.</w:t>
-            </w:r>
-          </w:p>
-          <w:p>
-            <w:r>
-              <w:rPr>
-                <w:b w:val="false"/>
-                <w:bCs w:val="false"/>
-              </w:rPr>
-              <w:t xml:space="preserve">COMMENT INFO: continue
-</w:t>
-            </w:r>
-          </w:p>
-          <w:p>
-            <w:r>
-              <w:rPr>
-                <w:b w:val="false"/>
-                <w:bCs w:val="false"/>
-              </w:rPr>
-              <w:t xml:space="preserve">rnd will check. We need re-crystallization?</w:t>
+              <w:t xml:space="preserve">Clean</w:t>
+            </w:r>
+            <w:r>
+              <w:rPr>
+                <w:b w:val="false"/>
+                <w:bCs w:val="false"/>
+              </w:rPr>
+              <w:t xml:space="preserve"> the equipment:</w:t>
+            </w:r>
+          </w:p>
+          <w:p>
+            <w:r>
+              <w:rPr>
+                <w:b w:val="false"/>
+                <w:bCs w:val="false"/>
+              </w:rPr>
+              <w:t xml:space="preserve">1. Follow the solvent sequence: </w:t>
+            </w:r>
+            <w:r>
+              <w:rPr>
+                <w:b/>
+                <w:bCs/>
+              </w:rPr>
+              <w:t xml:space="preserve">MeOH, Water, Acetone</w:t>
+            </w:r>
+            <w:r>
+              <w:rPr>
+                <w:b w:val="false"/>
+                <w:bCs w:val="false"/>
+              </w:rPr>
+              <w:t xml:space="preserve">.</w:t>
+            </w:r>
+          </w:p>
+          <w:p>
+            <w:r>
+              <w:rPr>
+                <w:b w:val="false"/>
+                <w:bCs w:val="false"/>
+              </w:rPr>
+              <w:t xml:space="preserve">2. Estimated time required: </w:t>
+            </w:r>
+            <w:r>
+              <w:rPr>
+                <w:b/>
+                <w:bCs/>
+              </w:rPr>
+              <w:t xml:space="preserve">3-5h</w:t>
+            </w:r>
+            <w:r>
+              <w:rPr>
+                <w:b w:val="false"/>
+                <w:bCs w:val="false"/>
+              </w:rPr>
+              <w:t xml:space="preserve">.</w:t>
             </w:r>
           </w:p>
         </w:tc>
@@ -9963,108 +9833,6 @@
           <w:p>
             <w:r>
               <w:t xml:space="preserve">42</w:t>
-            </w:r>
-          </w:p>
-        </w:tc>
-        <w:tc>
-          <w:p>
-            <w:r>
-              <w:rPr>
-                <w:b/>
-                <w:bCs/>
-              </w:rPr>
-              <w:t xml:space="preserve">Clean</w:t>
-            </w:r>
-            <w:r>
-              <w:rPr>
-                <w:b w:val="false"/>
-                <w:bCs w:val="false"/>
-              </w:rPr>
-              <w:t xml:space="preserve"> the equipment:</w:t>
-            </w:r>
-          </w:p>
-          <w:p>
-            <w:r>
-              <w:rPr>
-                <w:b w:val="false"/>
-                <w:bCs w:val="false"/>
-              </w:rPr>
-              <w:t xml:space="preserve">1. Follow the solvent sequence: </w:t>
-            </w:r>
-            <w:r>
-              <w:rPr>
-                <w:b/>
-                <w:bCs/>
-              </w:rPr>
-              <w:t xml:space="preserve">MeOH, Water, Acetone</w:t>
-            </w:r>
-            <w:r>
-              <w:rPr>
-                <w:b w:val="false"/>
-                <w:bCs w:val="false"/>
-              </w:rPr>
-              <w:t xml:space="preserve">.</w:t>
-            </w:r>
-          </w:p>
-          <w:p>
-            <w:r>
-              <w:rPr>
-                <w:b w:val="false"/>
-                <w:bCs w:val="false"/>
-              </w:rPr>
-              <w:t xml:space="preserve">2. Estimated time required: </w:t>
-            </w:r>
-            <w:r>
-              <w:rPr>
-                <w:b/>
-                <w:bCs/>
-              </w:rPr>
-              <w:t xml:space="preserve">3-5h</w:t>
-            </w:r>
-            <w:r>
-              <w:rPr>
-                <w:b w:val="false"/>
-                <w:bCs w:val="false"/>
-              </w:rPr>
-              <w:t xml:space="preserve">.</w:t>
-            </w:r>
-          </w:p>
-        </w:tc>
-        <w:tc>
-          <w:p>
-            <w:r>
-              <w:t xml:space="preserve">Start:</w:t>
-            </w:r>
-          </w:p>
-          <w:p>
-            <w:r>
-              <w:t xml:space="preserve">__:__</w:t>
-            </w:r>
-          </w:p>
-          <w:p>
-            <w:r>
-              <w:t xml:space="preserve">End:</w:t>
-            </w:r>
-          </w:p>
-          <w:p>
-            <w:r>
-              <w:t xml:space="preserve">__:__</w:t>
-            </w:r>
-          </w:p>
-        </w:tc>
-        <w:tc>
-          <w:p>
-            <w:r>
-              <w:t xml:space="preserve"/>
-            </w:r>
-          </w:p>
-        </w:tc>
-      </w:tr>
-      <w:tr>
-        <w:tc>
-          <w:p>
-            <w:r>
-              <w:t xml:space="preserve">43</w:t>
             </w:r>
           </w:p>
         </w:tc>

</xml_diff>